<commit_message>
Adiciona E-mail 6 (Simples Nacional) ao pacote de e-mails
Novo modelo para clientes do Simples que vendem B2B, sobre a escolha
entre manter IBS/CBS no DAS ou optar pelo regime regular a partir de
2027. Mesma formatação dos demais e-mails; índice e contagens
atualizados para 6.

Co-Authored-By: Claude Opus 5.5 <noreply@anthropic.com>
Claude-Session: https://claude.ai/code/session_01QYwcJjPUYq8ygjfThwkuQh
</commit_message>
<xml_diff>
--- a/kit-corrigido/emails_prontos_reforma_tributaria_2026.docx
+++ b/kit-corrigido/emails_prontos_reforma_tributaria_2026.docx
@@ -42,7 +42,7 @@
           <w:color w:val="D97757"/>
           <w:sz w:val="28"/>
         </w:rPr>
-        <w:t>5 modelos para comunicar seus clientes com segurança.</w:t>
+        <w:t>6 modelos para comunicar seus clientes com segurança.</w:t>
       </w:r>
     </w:p>
     <w:p>
@@ -82,7 +82,7 @@
           <w:color w:val="1F1F1F"/>
           <w:sz w:val="22"/>
         </w:rPr>
-        <w:t>Este pacote contém 5 modelos de e-mail testados e aprovados para os momentos mais sensíveis da comunicação contador-cliente durante a Reforma Tributária. Cada modelo foi desenhado para transmitir segurança técnica, humanidade e posicionar você como autoridade.</w:t>
+        <w:t>Este pacote contém 6 modelos de e-mail testados e aprovados para os momentos mais sensíveis da comunicação contador-cliente durante a Reforma Tributária. Cada modelo foi desenhado para transmitir segurança técnica, humanidade e posicionar você como autoridade.</w:t>
       </w:r>
     </w:p>
     <w:p>
@@ -237,6 +237,20 @@
           <w:sz w:val="21"/>
         </w:rPr>
         <w:t>E-mail 5 · Oferta de consultoria de adaptação (upsell)</w:t>
+      </w:r>
+    </w:p>
+    <w:p>
+      <w:pPr>
+        <w:spacing w:before="0" w:after="240"/>
+      </w:pPr>
+      <w:r>
+        <w:rPr>
+          <w:b w:val="0"/>
+          <w:i w:val="0"/>
+          <w:color w:val="1F1F1F"/>
+          <w:sz w:val="21"/>
+        </w:rPr>
+        <w:t>E-mail 6 · Simples Nacional: manter no DAS ou optar pelo IBS/CBS regular</w:t>
       </w:r>
     </w:p>
     <w:p>
@@ -2466,6 +2480,446 @@
           <w:color w:val="FFFFFF"/>
           <w:sz w:val="16"/>
         </w:rPr>
+        <w:t xml:space="preserve">  E-MAIL 06 · SIMPLES NACIONAL · OPÇÃO DE IBS/CBS  </w:t>
+      </w:r>
+    </w:p>
+    <w:p>
+      <w:pPr>
+        <w:spacing w:before="240" w:after="80"/>
+      </w:pPr>
+      <w:r>
+        <w:rPr>
+          <w:rFonts w:ascii="Georgia" w:hAnsi="Georgia"/>
+          <w:b/>
+          <w:color w:val="1F1F1F"/>
+          <w:sz w:val="36"/>
+        </w:rPr>
+        <w:t>Simples Nacional: uma escolha que pode afetar suas vendas</w:t>
+      </w:r>
+    </w:p>
+    <w:p>
+      <w:pPr>
+        <w:spacing w:before="0" w:after="200"/>
+      </w:pPr>
+      <w:r>
+        <w:rPr>
+          <w:b w:val="0"/>
+          <w:i/>
+          <w:color w:val="5A5A5A"/>
+          <w:sz w:val="20"/>
+        </w:rPr>
+        <w:t>Use para: clientes do Simples Nacional que vendem para outras empresas (B2B). Envie antes do prazo de opção do semestre.</w:t>
+      </w:r>
+    </w:p>
+    <w:p>
+      <w:pPr>
+        <w:spacing w:before="200" w:after="40"/>
+      </w:pPr>
+      <w:r>
+        <w:rPr>
+          <w:rFonts w:ascii="Calibri" w:hAnsi="Calibri"/>
+          <w:b/>
+          <w:color w:val="D97757"/>
+          <w:sz w:val="18"/>
+        </w:rPr>
+        <w:t>ASSUNTO</w:t>
+      </w:r>
+    </w:p>
+    <w:p>
+      <w:pPr>
+        <w:spacing w:before="0" w:after="160"/>
+      </w:pPr>
+      <w:r>
+        <w:rPr>
+          <w:b/>
+          <w:i w:val="0"/>
+          <w:color w:val="1F1F1F"/>
+          <w:sz w:val="22"/>
+        </w:rPr>
+        <w:t>[Primeiro nome], uma decisão sobre o Simples que afeta suas vendas</w:t>
+      </w:r>
+    </w:p>
+    <w:p>
+      <w:pPr>
+        <w:spacing w:before="200" w:after="40"/>
+      </w:pPr>
+      <w:r>
+        <w:rPr>
+          <w:rFonts w:ascii="Calibri" w:hAnsi="Calibri"/>
+          <w:b/>
+          <w:color w:val="D97757"/>
+          <w:sz w:val="18"/>
+        </w:rPr>
+        <w:t>CORPO DO E-MAIL</w:t>
+      </w:r>
+    </w:p>
+    <w:p>
+      <w:pPr>
+        <w:spacing w:after="80"/>
+        <w:ind w:left="170"/>
+        <w:shd w:val="clear" w:color="auto" w:fill="FAF9F5"/>
+        <w:pBdr>
+          <w:left w:val="single" w:sz="18" w:space="8" w:color="D97757"/>
+        </w:pBdr>
+      </w:pPr>
+      <w:r>
+        <w:rPr>
+          <w:rFonts w:ascii="Calibri" w:hAnsi="Calibri"/>
+          <w:color w:val="1F1F1F"/>
+          <w:sz w:val="21"/>
+        </w:rPr>
+        <w:t>Olá, [Primeiro nome],</w:t>
+      </w:r>
+    </w:p>
+    <w:p>
+      <w:pPr>
+        <w:spacing w:after="160"/>
+        <w:ind w:left="170"/>
+        <w:shd w:val="clear" w:color="auto" w:fill="FAF9F5"/>
+        <w:pBdr>
+          <w:left w:val="single" w:sz="18" w:space="8" w:color="D97757"/>
+        </w:pBdr>
+      </w:pPr>
+    </w:p>
+    <w:p>
+      <w:pPr>
+        <w:spacing w:after="80"/>
+        <w:ind w:left="170"/>
+        <w:shd w:val="clear" w:color="auto" w:fill="FAF9F5"/>
+        <w:pBdr>
+          <w:left w:val="single" w:sz="18" w:space="8" w:color="D97757"/>
+        </w:pBdr>
+      </w:pPr>
+      <w:r>
+        <w:rPr>
+          <w:rFonts w:ascii="Calibri" w:hAnsi="Calibri"/>
+          <w:color w:val="1F1F1F"/>
+          <w:sz w:val="21"/>
+        </w:rPr>
+        <w:t>A [Nome da Empresa] continua no Simples Nacional com a Reforma Tributária. Mas, a partir de 2027, existe uma escolha que merece a nossa atenção — principalmente porque boa parte dos seus clientes são outras empresas.</w:t>
+      </w:r>
+    </w:p>
+    <w:p>
+      <w:pPr>
+        <w:spacing w:after="160"/>
+        <w:ind w:left="170"/>
+        <w:shd w:val="clear" w:color="auto" w:fill="FAF9F5"/>
+        <w:pBdr>
+          <w:left w:val="single" w:sz="18" w:space="8" w:color="D97757"/>
+        </w:pBdr>
+      </w:pPr>
+    </w:p>
+    <w:p>
+      <w:pPr>
+        <w:spacing w:after="80"/>
+        <w:ind w:left="170"/>
+        <w:shd w:val="clear" w:color="auto" w:fill="FAF9F5"/>
+        <w:pBdr>
+          <w:left w:val="single" w:sz="18" w:space="8" w:color="D97757"/>
+        </w:pBdr>
+      </w:pPr>
+      <w:r>
+        <w:rPr>
+          <w:rFonts w:ascii="Calibri" w:hAnsi="Calibri"/>
+          <w:color w:val="1F1F1F"/>
+          <w:sz w:val="21"/>
+        </w:rPr>
+        <w:t>Por que isso importa: no novo sistema, quem compra de você pode abater do próprio imposto o IBS e a CBS pagos na compra (o chamado crédito). Quando o fornecedor recolhe esses tributos dentro do DAS, o crédito que ele transfere tende a ser menor — e alguns compradores podem passar a preferir fornecedores que geram crédito maior.</w:t>
+      </w:r>
+    </w:p>
+    <w:p>
+      <w:pPr>
+        <w:spacing w:after="160"/>
+        <w:ind w:left="170"/>
+        <w:shd w:val="clear" w:color="auto" w:fill="FAF9F5"/>
+        <w:pBdr>
+          <w:left w:val="single" w:sz="18" w:space="8" w:color="D97757"/>
+        </w:pBdr>
+      </w:pPr>
+    </w:p>
+    <w:p>
+      <w:pPr>
+        <w:spacing w:after="80"/>
+        <w:ind w:left="170"/>
+        <w:shd w:val="clear" w:color="auto" w:fill="FAF9F5"/>
+        <w:pBdr>
+          <w:left w:val="single" w:sz="18" w:space="8" w:color="D97757"/>
+        </w:pBdr>
+      </w:pPr>
+      <w:r>
+        <w:rPr>
+          <w:rFonts w:ascii="Calibri" w:hAnsi="Calibri"/>
+          <w:color w:val="1F1F1F"/>
+          <w:sz w:val="21"/>
+        </w:rPr>
+        <w:t>A lei oferece dois caminhos:</w:t>
+      </w:r>
+    </w:p>
+    <w:p>
+      <w:pPr>
+        <w:spacing w:after="160"/>
+        <w:ind w:left="170"/>
+        <w:shd w:val="clear" w:color="auto" w:fill="FAF9F5"/>
+        <w:pBdr>
+          <w:left w:val="single" w:sz="18" w:space="8" w:color="D97757"/>
+        </w:pBdr>
+      </w:pPr>
+    </w:p>
+    <w:p>
+      <w:pPr>
+        <w:spacing w:after="80"/>
+        <w:ind w:left="170"/>
+        <w:shd w:val="clear" w:color="auto" w:fill="FAF9F5"/>
+        <w:pBdr>
+          <w:left w:val="single" w:sz="18" w:space="8" w:color="D97757"/>
+        </w:pBdr>
+      </w:pPr>
+      <w:r>
+        <w:rPr>
+          <w:rFonts w:ascii="Calibri" w:hAnsi="Calibri"/>
+          <w:color w:val="1F1F1F"/>
+          <w:sz w:val="21"/>
+        </w:rPr>
+        <w:t>· Caminho A — manter tudo no DAS: a rotina continua igual à de hoje, mas seus clientes empresas recebem um crédito menor.</w:t>
+      </w:r>
+    </w:p>
+    <w:p>
+      <w:pPr>
+        <w:spacing w:after="80"/>
+        <w:ind w:left="170"/>
+        <w:shd w:val="clear" w:color="auto" w:fill="FAF9F5"/>
+        <w:pBdr>
+          <w:left w:val="single" w:sz="18" w:space="8" w:color="D97757"/>
+        </w:pBdr>
+      </w:pPr>
+      <w:r>
+        <w:rPr>
+          <w:rFonts w:ascii="Calibri" w:hAnsi="Calibri"/>
+          <w:color w:val="1F1F1F"/>
+          <w:sz w:val="21"/>
+        </w:rPr>
+        <w:t>· Caminho B — recolher IBS e CBS por fora do DAS (regime regular), continuando no Simples para os demais tributos: você passa a gerar crédito integral para os seus clientes e a aproveitar créditos das suas compras, mas a apuração fica mais trabalhosa.</w:t>
+      </w:r>
+    </w:p>
+    <w:p>
+      <w:pPr>
+        <w:spacing w:after="160"/>
+        <w:ind w:left="170"/>
+        <w:shd w:val="clear" w:color="auto" w:fill="FAF9F5"/>
+        <w:pBdr>
+          <w:left w:val="single" w:sz="18" w:space="8" w:color="D97757"/>
+        </w:pBdr>
+      </w:pPr>
+    </w:p>
+    <w:p>
+      <w:pPr>
+        <w:spacing w:after="80"/>
+        <w:ind w:left="170"/>
+        <w:shd w:val="clear" w:color="auto" w:fill="FAF9F5"/>
+        <w:pBdr>
+          <w:left w:val="single" w:sz="18" w:space="8" w:color="D97757"/>
+        </w:pBdr>
+      </w:pPr>
+      <w:r>
+        <w:rPr>
+          <w:rFonts w:ascii="Calibri" w:hAnsi="Calibri"/>
+          <w:color w:val="1F1F1F"/>
+          <w:sz w:val="21"/>
+        </w:rPr>
+        <w:t>Não existe resposta certa para todo mundo. A escolha depende de quanto você vende para outras empresas, de quanto compra com direito a crédito e da sua margem. Para quem vende principalmente ao consumidor final, manter tudo no DAS costuma ser o melhor caminho.</w:t>
+      </w:r>
+    </w:p>
+    <w:p>
+      <w:pPr>
+        <w:spacing w:after="160"/>
+        <w:ind w:left="170"/>
+        <w:shd w:val="clear" w:color="auto" w:fill="FAF9F5"/>
+        <w:pBdr>
+          <w:left w:val="single" w:sz="18" w:space="8" w:color="D97757"/>
+        </w:pBdr>
+      </w:pPr>
+    </w:p>
+    <w:p>
+      <w:pPr>
+        <w:spacing w:after="80"/>
+        <w:ind w:left="170"/>
+        <w:shd w:val="clear" w:color="auto" w:fill="FAF9F5"/>
+        <w:pBdr>
+          <w:left w:val="single" w:sz="18" w:space="8" w:color="D97757"/>
+        </w:pBdr>
+      </w:pPr>
+      <w:r>
+        <w:rPr>
+          <w:rFonts w:ascii="Calibri" w:hAnsi="Calibri"/>
+          <w:color w:val="1F1F1F"/>
+          <w:sz w:val="21"/>
+        </w:rPr>
+        <w:t>Nossa proposta: simular os dois cenários com os números da [Nome da Empresa] e apresentar o resultado antes do prazo de opção, que é feita por semestre, conforme a regulamentação.</w:t>
+      </w:r>
+    </w:p>
+    <w:p>
+      <w:pPr>
+        <w:spacing w:after="160"/>
+        <w:ind w:left="170"/>
+        <w:shd w:val="clear" w:color="auto" w:fill="FAF9F5"/>
+        <w:pBdr>
+          <w:left w:val="single" w:sz="18" w:space="8" w:color="D97757"/>
+        </w:pBdr>
+      </w:pPr>
+    </w:p>
+    <w:p>
+      <w:pPr>
+        <w:spacing w:after="80"/>
+        <w:ind w:left="170"/>
+        <w:shd w:val="clear" w:color="auto" w:fill="FAF9F5"/>
+        <w:pBdr>
+          <w:left w:val="single" w:sz="18" w:space="8" w:color="D97757"/>
+        </w:pBdr>
+      </w:pPr>
+      <w:r>
+        <w:rPr>
+          <w:rFonts w:ascii="Calibri" w:hAnsi="Calibri"/>
+          <w:color w:val="1F1F1F"/>
+          <w:sz w:val="21"/>
+        </w:rPr>
+        <w:t>Para a simulação, se puder, me envie: faturamento médio mensal, percentual de vendas para empresas e as principais compras do mês.</w:t>
+      </w:r>
+    </w:p>
+    <w:p>
+      <w:pPr>
+        <w:spacing w:after="160"/>
+        <w:ind w:left="170"/>
+        <w:shd w:val="clear" w:color="auto" w:fill="FAF9F5"/>
+        <w:pBdr>
+          <w:left w:val="single" w:sz="18" w:space="8" w:color="D97757"/>
+        </w:pBdr>
+      </w:pPr>
+    </w:p>
+    <w:p>
+      <w:pPr>
+        <w:spacing w:after="80"/>
+        <w:ind w:left="170"/>
+        <w:shd w:val="clear" w:color="auto" w:fill="FAF9F5"/>
+        <w:pBdr>
+          <w:left w:val="single" w:sz="18" w:space="8" w:color="D97757"/>
+        </w:pBdr>
+      </w:pPr>
+      <w:r>
+        <w:rPr>
+          <w:rFonts w:ascii="Calibri" w:hAnsi="Calibri"/>
+          <w:color w:val="1F1F1F"/>
+          <w:sz w:val="21"/>
+        </w:rPr>
+        <w:t>Podemos conversar 30 minutos esta semana? Me responde com dois horários que funcionam e eu envio o convite.</w:t>
+      </w:r>
+    </w:p>
+    <w:p>
+      <w:pPr>
+        <w:spacing w:after="160"/>
+        <w:ind w:left="170"/>
+        <w:shd w:val="clear" w:color="auto" w:fill="FAF9F5"/>
+        <w:pBdr>
+          <w:left w:val="single" w:sz="18" w:space="8" w:color="D97757"/>
+        </w:pBdr>
+      </w:pPr>
+    </w:p>
+    <w:p>
+      <w:pPr>
+        <w:spacing w:after="80"/>
+        <w:ind w:left="170"/>
+        <w:shd w:val="clear" w:color="auto" w:fill="FAF9F5"/>
+        <w:pBdr>
+          <w:left w:val="single" w:sz="18" w:space="8" w:color="D97757"/>
+        </w:pBdr>
+      </w:pPr>
+      <w:r>
+        <w:rPr>
+          <w:rFonts w:ascii="Calibri" w:hAnsi="Calibri"/>
+          <w:color w:val="1F1F1F"/>
+          <w:sz w:val="21"/>
+        </w:rPr>
+        <w:t>Abraço,</w:t>
+      </w:r>
+    </w:p>
+    <w:p>
+      <w:pPr>
+        <w:spacing w:after="80"/>
+        <w:ind w:left="170"/>
+        <w:shd w:val="clear" w:color="auto" w:fill="FAF9F5"/>
+        <w:pBdr>
+          <w:left w:val="single" w:sz="18" w:space="8" w:color="D97757"/>
+        </w:pBdr>
+      </w:pPr>
+      <w:r>
+        <w:rPr>
+          <w:rFonts w:ascii="Calibri" w:hAnsi="Calibri"/>
+          <w:color w:val="1F1F1F"/>
+          <w:sz w:val="21"/>
+        </w:rPr>
+        <w:t>[Seu nome]</w:t>
+      </w:r>
+    </w:p>
+    <w:p>
+      <w:pPr>
+        <w:spacing w:after="80"/>
+        <w:ind w:left="170"/>
+        <w:shd w:val="clear" w:color="auto" w:fill="FAF9F5"/>
+        <w:pBdr>
+          <w:left w:val="single" w:sz="18" w:space="8" w:color="D97757"/>
+        </w:pBdr>
+      </w:pPr>
+      <w:r>
+        <w:rPr>
+          <w:rFonts w:ascii="Calibri" w:hAnsi="Calibri"/>
+          <w:color w:val="1F1F1F"/>
+          <w:sz w:val="21"/>
+        </w:rPr>
+        <w:t>[Nome do Escritório]</w:t>
+      </w:r>
+    </w:p>
+    <w:p>
+      <w:pPr>
+        <w:spacing w:before="120" w:after="200"/>
+        <w:ind w:left="170"/>
+        <w:shd w:val="clear" w:color="auto" w:fill="FFF5F0"/>
+        <w:pBdr>
+          <w:left w:val="single" w:sz="12" w:space="8" w:color="D97757"/>
+        </w:pBdr>
+      </w:pPr>
+      <w:r>
+        <w:rPr>
+          <w:b/>
+          <w:color w:val="D97757"/>
+          <w:sz w:val="20"/>
+        </w:rPr>
+        <w:t xml:space="preserve">💡 Dica: </w:t>
+      </w:r>
+      <w:r>
+        <w:rPr>
+          <w:i/>
+          <w:color w:val="5A5A5A"/>
+          <w:sz w:val="20"/>
+        </w:rPr>
+        <w:t>Leve os números prontos: rode o Simulador de Impacto do kit com os cenários A e B do Simples. E reavalie a escolha sempre que o perfil de clientes mudar.</w:t>
+      </w:r>
+    </w:p>
+    <w:p>
+      <w:r>
+        <w:br w:type="page"/>
+      </w:r>
+    </w:p>
+    <w:p>
+      <w:pPr>
+        <w:spacing w:after="80"/>
+        <w:shd w:val="clear" w:color="auto" w:fill="D97757"/>
+      </w:pPr>
+      <w:r>
+        <w:rPr>
+          <w:rFonts w:ascii="Calibri" w:hAnsi="Calibri"/>
+          <w:b/>
+          <w:color w:val="FFFFFF"/>
+          <w:sz w:val="16"/>
+        </w:rPr>
         <w:t xml:space="preserve">  GUIA RÁPIDO · BOAS PRÁTICAS  </w:t>
       </w:r>
     </w:p>
@@ -2652,7 +3106,7 @@
           <w:color w:val="5A5A5A"/>
           <w:sz w:val="22"/>
         </w:rPr>
-        <w:t>5 e-mails · 5 momentos · 1 cliente mais seguro.</w:t>
+        <w:t>6 e-mails · 6 momentos · 1 cliente mais seguro.</w:t>
       </w:r>
     </w:p>
     <w:p>

</xml_diff>